<commit_message>
Connect onboarding and Vapi call log to Make + Supabase; switch docs from Retell to Vapi
- onboarding: ONBOARDING_WEBHOOK now points to the Make scenario that stores
  each submission in the Supabase `leads` table
- backend/supabase: document the live `calls`/`bookings` schema (000) and the
  `leads` table + fill trigger (002), both applied to the project
- docs/make-supabase.md: real state of Make and Supabase, scenario IDs,
  operation budget and the pitfalls fixed in the Vapi end-of-call scenario
- docs/vapi-asistente-sofia.md: corrected Vapi assistant prompt (Sofía,
  AI Staff brand, site prices, phased channels, recording notice)
- privacy page, contracts (docx + pdf), legal guide and playbook: list Vapi
  and its sub-processors (ElevenLabs, Soniox, OpenAI) instead of Retell
- CLAUDE.md and project guide (md + pdf) updated accordingly

Co-Authored-By: Claude Opus 5.5 <noreply@anthropic.com>
Claude-Session: https://claude.ai/code/session_01KTQA4469UcXc7qY4pBkaJS
</commit_message>
<xml_diff>
--- a/docs/legal/AI-Staff_Contrat-de-service_FR.docx
+++ b/docs/legal/AI-Staff_Contrat-de-service_FR.docx
@@ -2686,7 +2686,7 @@
       </w:tr>
       <w:tr>
         <w:trPr>
-          <w:tblHeader w:val="false"/>
+          <w:tblHeader w:val="off"/>
         </w:trPr>
         <w:tc>
           <w:tcPr>
@@ -2789,7 +2789,7 @@
       </w:tr>
       <w:tr>
         <w:trPr>
-          <w:tblHeader w:val="false"/>
+          <w:tblHeader w:val="off"/>
         </w:trPr>
         <w:tc>
           <w:tcPr>
@@ -2899,7 +2899,7 @@
       </w:tr>
       <w:tr>
         <w:trPr>
-          <w:tblHeader w:val="false"/>
+          <w:tblHeader w:val="off"/>
         </w:trPr>
         <w:tc>
           <w:tcPr>
@@ -3634,7 +3634,7 @@
       </w:tr>
       <w:tr>
         <w:trPr>
-          <w:tblHeader w:val="false"/>
+          <w:tblHeader w:val="off"/>
         </w:trPr>
         <w:tc>
           <w:tcPr>
@@ -3704,7 +3704,7 @@
       </w:tr>
       <w:tr>
         <w:trPr>
-          <w:tblHeader w:val="false"/>
+          <w:tblHeader w:val="off"/>
         </w:trPr>
         <w:tc>
           <w:tcPr>
@@ -3774,7 +3774,7 @@
       </w:tr>
       <w:tr>
         <w:trPr>
-          <w:tblHeader w:val="false"/>
+          <w:tblHeader w:val="off"/>
         </w:trPr>
         <w:tc>
           <w:tcPr>
@@ -3844,7 +3844,7 @@
       </w:tr>
       <w:tr>
         <w:trPr>
-          <w:tblHeader w:val="false"/>
+          <w:tblHeader w:val="off"/>
         </w:trPr>
         <w:tc>
           <w:tcPr>
@@ -3914,7 +3914,7 @@
       </w:tr>
       <w:tr>
         <w:trPr>
-          <w:tblHeader w:val="false"/>
+          <w:tblHeader w:val="off"/>
         </w:trPr>
         <w:tc>
           <w:tcPr>
@@ -3984,7 +3984,7 @@
       </w:tr>
       <w:tr>
         <w:trPr>
-          <w:tblHeader w:val="false"/>
+          <w:tblHeader w:val="off"/>
         </w:trPr>
         <w:tc>
           <w:tcPr>
@@ -4054,7 +4054,7 @@
       </w:tr>
       <w:tr>
         <w:trPr>
-          <w:tblHeader w:val="false"/>
+          <w:tblHeader w:val="off"/>
         </w:trPr>
         <w:tc>
           <w:tcPr>
@@ -4606,7 +4606,7 @@
         <w:t xml:space="preserve">2.4	</w:t>
       </w:r>
       <w:r>
-        <w:t xml:space="preserve">Encadrer chaque sous-traitant par une entente écrite offrant une protection équivalente. Liste actuelle : Retell AI (voix), Twilio (téléphonie, SMS), Anthropic (modèle de langage), Make.com (automatisations), Supabase (base de données), Resend (courriels), et Google si le Client connecte ces services. AI Staff avise le Client de tout ajout ou remplacement; le Client peut s'y opposer pour un motif raisonnable en résiliant sans frais.</w:t>
+        <w:t xml:space="preserve">Encadrer chaque sous-traitant par une entente écrite offrant une protection équivalente. Liste actuelle : Vapi (plateforme vocale) et ses fournisseurs de voix, de transcription et de modèle de conversation (ElevenLabs, Soniox, OpenAI), Twilio (téléphonie, SMS), Anthropic (modèle de langage), Make.com (automatisations), Supabase (base de données), Resend (courriels), et Google si le Client connecte ces services. AI Staff avise le Client de tout ajout ou remplacement; le Client peut s'y opposer pour un motif raisonnable en résiliant sans frais.</w:t>
       </w:r>
     </w:p>
     <w:p>
@@ -5446,8 +5446,8 @@
       </w:tr>
     </w:tbl>
     <w:sectPr>
-      <w:headerReference w:type="default" r:id="rId7"/>
-      <w:footerReference w:type="default" r:id="rId8"/>
+      <w:headerReference w:type="default" r:id="rId6"/>
+      <w:footerReference w:type="default" r:id="rId7"/>
       <w:pgSz w:w="12240" w:h="15840" w:orient="portrait"/>
       <w:pgMar w:top="1200" w:right="1260" w:bottom="1100" w:left="1260" w:header="560" w:footer="520" w:gutter="0"/>
       <w:pgNumType/>
@@ -5455,10 +5455,6 @@
     </w:sectPr>
   </w:body>
 </w:document>
-</file>
-
-<file path=word/comments.xml><?xml version="1.0" encoding="utf-8"?>
-<w:comments xmlns:cx="http://schemas.microsoft.com/office/drawing/2014/chartex" xmlns:cx1="http://schemas.microsoft.com/office/drawing/2015/9/8/chartex" xmlns:cx2="http://schemas.microsoft.com/office/drawing/2015/10/21/chartex" xmlns:cx3="http://schemas.microsoft.com/office/drawing/2016/5/9/chartex" xmlns:cx4="http://schemas.microsoft.com/office/drawing/2016/5/10/chartex" xmlns:cx5="http://schemas.microsoft.com/office/drawing/2016/5/11/chartex" xmlns:cx6="http://schemas.microsoft.com/office/drawing/2016/5/12/chartex" xmlns:cx7="http://schemas.microsoft.com/office/drawing/2016/5/13/chartex" xmlns:cx8="http://schemas.microsoft.com/office/drawing/2016/5/14/chartex" xmlns:mc="http://schemas.openxmlformats.org/markup-compatibility/2006" xmlns:aink="http://schemas.microsoft.com/office/drawing/2016/ink" xmlns:am3d="http://schemas.microsoft.com/office/drawing/2017/model3d" xmlns:o="urn:schemas-microsoft-com:office:office" xmlns:r="http://schemas.openxmlformats.org/officeDocument/2006/relationships" xmlns:m="http://schemas.openxmlformats.org/officeDocument/2006/math" xmlns:v="urn:schemas-microsoft-com:vml" xmlns:wp14="http://schemas.microsoft.com/office/word/2010/wordprocessingDrawing" xmlns:wp="http://schemas.openxmlformats.org/drawingml/2006/wordprocessingDrawing" xmlns:w10="urn:schemas-microsoft-com:office:word" xmlns:w="http://schemas.openxmlformats.org/wordprocessingml/2006/main" xmlns:w14="http://schemas.microsoft.com/office/word/2010/wordml" xmlns:w15="http://schemas.microsoft.com/office/word/2012/wordml" xmlns:w16cex="http://schemas.microsoft.com/office/word/2018/wordml/cex" xmlns:w16cid="http://schemas.microsoft.com/office/word/2016/wordml/cid" xmlns:w16="http://schemas.microsoft.com/office/word/2018/wordml" xmlns:w16sdtdh="http://schemas.microsoft.com/office/word/2020/wordml/sdtdatahash" xmlns:w16se="http://schemas.microsoft.com/office/word/2015/wordml/symex" xmlns:wpg="http://schemas.microsoft.com/office/word/2010/wordprocessingGroup" xmlns:wpi="http://schemas.microsoft.com/office/word/2010/wordprocessingInk" xmlns:wne="http://schemas.microsoft.com/office/word/2006/wordml" xmlns:wps="http://schemas.microsoft.com/office/word/2010/wordprocessingShape"/>
 </file>
 
 <file path=word/endnotes.xml><?xml version="1.0" encoding="utf-8"?>
@@ -5613,7 +5609,7 @@
 <w:numbering xmlns:wpc="http://schemas.microsoft.com/office/word/2010/wordprocessingCanvas" xmlns:mc="http://schemas.openxmlformats.org/markup-compatibility/2006" xmlns:o="urn:schemas-microsoft-com:office:office" xmlns:r="http://schemas.openxmlformats.org/officeDocument/2006/relationships" xmlns:m="http://schemas.openxmlformats.org/officeDocument/2006/math" xmlns:v="urn:schemas-microsoft-com:vml" xmlns:wp14="http://schemas.microsoft.com/office/word/2010/wordprocessingDrawing" xmlns:wp="http://schemas.openxmlformats.org/drawingml/2006/wordprocessingDrawing" xmlns:w10="urn:schemas-microsoft-com:office:word" xmlns:w="http://schemas.openxmlformats.org/wordprocessingml/2006/main" xmlns:w14="http://schemas.microsoft.com/office/word/2010/wordml" xmlns:w15="http://schemas.microsoft.com/office/word/2012/wordml" xmlns:wpg="http://schemas.microsoft.com/office/word/2010/wordprocessingGroup" xmlns:wpi="http://schemas.microsoft.com/office/word/2010/wordprocessingInk" xmlns:wne="http://schemas.microsoft.com/office/word/2006/wordml" xmlns:wps="http://schemas.microsoft.com/office/word/2010/wordprocessingShape" mc:Ignorable="w14 w15 wp14">
   <w:abstractNum w:abstractNumId="1" w15:restartNumberingAfterBreak="0">
     <w:multiLevelType w:val="hybridMultilevel"/>
-    <w:lvl w:ilvl="0" w15:tentative="1">
+    <w:lvl w:ilvl="0" w:tentative="1">
       <w:start w:val="1"/>
       <w:numFmt w:val="bullet"/>
       <w:lvlText w:val="●"/>
@@ -5622,7 +5618,7 @@
         <w:ind w:left="720" w:hanging="360"/>
       </w:pPr>
     </w:lvl>
-    <w:lvl w:ilvl="1" w15:tentative="1">
+    <w:lvl w:ilvl="1" w:tentative="1">
       <w:start w:val="1"/>
       <w:numFmt w:val="bullet"/>
       <w:lvlText w:val="○"/>
@@ -5631,7 +5627,7 @@
         <w:ind w:left="1440" w:hanging="360"/>
       </w:pPr>
     </w:lvl>
-    <w:lvl w:ilvl="2" w15:tentative="1">
+    <w:lvl w:ilvl="2" w:tentative="1">
       <w:start w:val="1"/>
       <w:numFmt w:val="bullet"/>
       <w:lvlText w:val="■"/>
@@ -5640,7 +5636,7 @@
         <w:ind w:left="2160" w:hanging="360"/>
       </w:pPr>
     </w:lvl>
-    <w:lvl w:ilvl="3" w15:tentative="1">
+    <w:lvl w:ilvl="3" w:tentative="1">
       <w:start w:val="1"/>
       <w:numFmt w:val="bullet"/>
       <w:lvlText w:val="●"/>
@@ -5649,7 +5645,7 @@
         <w:ind w:left="2880" w:hanging="360"/>
       </w:pPr>
     </w:lvl>
-    <w:lvl w:ilvl="4" w15:tentative="1">
+    <w:lvl w:ilvl="4" w:tentative="1">
       <w:start w:val="1"/>
       <w:numFmt w:val="bullet"/>
       <w:lvlText w:val="○"/>
@@ -5658,7 +5654,7 @@
         <w:ind w:left="3600" w:hanging="360"/>
       </w:pPr>
     </w:lvl>
-    <w:lvl w:ilvl="5" w15:tentative="1">
+    <w:lvl w:ilvl="5" w:tentative="1">
       <w:start w:val="1"/>
       <w:numFmt w:val="bullet"/>
       <w:lvlText w:val="■"/>
@@ -5667,7 +5663,7 @@
         <w:ind w:left="4320" w:hanging="360"/>
       </w:pPr>
     </w:lvl>
-    <w:lvl w:ilvl="6" w15:tentative="1">
+    <w:lvl w:ilvl="6" w:tentative="1">
       <w:start w:val="1"/>
       <w:numFmt w:val="bullet"/>
       <w:lvlText w:val="●"/>
@@ -5676,7 +5672,7 @@
         <w:ind w:left="5040" w:hanging="360"/>
       </w:pPr>
     </w:lvl>
-    <w:lvl w:ilvl="7" w15:tentative="1">
+    <w:lvl w:ilvl="7" w:tentative="1">
       <w:start w:val="1"/>
       <w:numFmt w:val="bullet"/>
       <w:lvlText w:val="●"/>
@@ -5685,7 +5681,7 @@
         <w:ind w:left="5760" w:hanging="360"/>
       </w:pPr>
     </w:lvl>
-    <w:lvl w:ilvl="8" w15:tentative="1">
+    <w:lvl w:ilvl="8" w:tentative="1">
       <w:start w:val="1"/>
       <w:numFmt w:val="bullet"/>
       <w:lvlText w:val="●"/>
@@ -5697,7 +5693,7 @@
   </w:abstractNum>
   <w:abstractNum w:abstractNumId="2" w15:restartNumberingAfterBreak="0">
     <w:multiLevelType w:val="hybridMultilevel"/>
-    <w:lvl w:ilvl="0" w15:tentative="1">
+    <w:lvl w:ilvl="0" w:tentative="1">
       <w:start w:val="1"/>
       <w:numFmt w:val="bullet"/>
       <w:lvlText w:val="•"/>
@@ -5729,6 +5725,10 @@
     </w:rPrDefault>
     <w:pPrDefault/>
   </w:docDefaults>
+  <w:style w:type="paragraph" w:styleId="Normal" w:default="1">
+    <w:name w:val="Normal"/>
+    <w:qFormat/>
+  </w:style>
   <w:style w:type="paragraph" w:styleId="Title">
     <w:name w:val="Title"/>
     <w:basedOn w:val="Normal"/>
@@ -5901,4 +5901,294 @@
     </w:rPr>
   </w:style>
 </w:styles>
+</file>
+
+<file path=word/theme/theme1.xml><?xml version="1.0" encoding="utf-8"?>
+<a:theme xmlns:a="http://schemas.openxmlformats.org/drawingml/2006/main" name="Office Theme">
+  <a:themeElements>
+    <a:clrScheme name="Office">
+      <a:dk1>
+        <a:sysClr val="windowText" lastClr="000000"/>
+      </a:dk1>
+      <a:lt1>
+        <a:sysClr val="window" lastClr="FFFFFF"/>
+      </a:lt1>
+      <a:dk2>
+        <a:srgbClr val="44546A"/>
+      </a:dk2>
+      <a:lt2>
+        <a:srgbClr val="E7E6E6"/>
+      </a:lt2>
+      <a:accent1>
+        <a:srgbClr val="4472C4"/>
+      </a:accent1>
+      <a:accent2>
+        <a:srgbClr val="ED7D31"/>
+      </a:accent2>
+      <a:accent3>
+        <a:srgbClr val="A5A5A5"/>
+      </a:accent3>
+      <a:accent4>
+        <a:srgbClr val="FFC000"/>
+      </a:accent4>
+      <a:accent5>
+        <a:srgbClr val="5B9BD5"/>
+      </a:accent5>
+      <a:accent6>
+        <a:srgbClr val="70AD47"/>
+      </a:accent6>
+      <a:hlink>
+        <a:srgbClr val="0563C1"/>
+      </a:hlink>
+      <a:folHlink>
+        <a:srgbClr val="954F72"/>
+      </a:folHlink>
+    </a:clrScheme>
+    <a:fontScheme name="Office">
+      <a:majorFont>
+        <a:latin typeface="Calibri Light" panose="020F0302020204030204"/>
+        <a:ea typeface=""/>
+        <a:cs typeface=""/>
+        <a:font script="Jpan" typeface="游ゴシック Light"/>
+        <a:font script="Hang" typeface="맑은 고딕"/>
+        <a:font script="Hans" typeface="等线 Light"/>
+        <a:font script="Hant" typeface="新細明體"/>
+        <a:font script="Arab" typeface="Times New Roman"/>
+        <a:font script="Hebr" typeface="Times New Roman"/>
+        <a:font script="Thai" typeface="Angsana New"/>
+        <a:font script="Ethi" typeface="Nyala"/>
+        <a:font script="Beng" typeface="Vrinda"/>
+        <a:font script="Gujr" typeface="Shruti"/>
+        <a:font script="Khmr" typeface="MoolBoran"/>
+        <a:font script="Knda" typeface="Tunga"/>
+        <a:font script="Guru" typeface="Raavi"/>
+        <a:font script="Cans" typeface="Euphemia"/>
+        <a:font script="Cher" typeface="Plantagenet Cherokee"/>
+        <a:font script="Yiii" typeface="Microsoft Yi Baiti"/>
+        <a:font script="Tibt" typeface="Microsoft Himalaya"/>
+        <a:font script="Thaa" typeface="MV Boli"/>
+        <a:font script="Deva" typeface="Mangal"/>
+        <a:font script="Telu" typeface="Gautami"/>
+        <a:font script="Taml" typeface="Latha"/>
+        <a:font script="Syrc" typeface="Estrangelo Edessa"/>
+        <a:font script="Orya" typeface="Kalinga"/>
+        <a:font script="Mlym" typeface="Kartika"/>
+        <a:font script="Laoo" typeface="DokChampa"/>
+        <a:font script="Sinh" typeface="Iskoola Pota"/>
+        <a:font script="Mong" typeface="Mongolian Baiti"/>
+        <a:font script="Viet" typeface="Times New Roman"/>
+        <a:font script="Uigh" typeface="Microsoft Uighur"/>
+        <a:font script="Geor" typeface="Sylfaen"/>
+        <a:font script="Armn" typeface="Arial"/>
+        <a:font script="Bugi" typeface="Leelawadee UI"/>
+        <a:font script="Bopo" typeface="Microsoft JhengHei"/>
+        <a:font script="Java" typeface="Javanese Text"/>
+        <a:font script="Lisu" typeface="Segoe UI"/>
+        <a:font script="Mymr" typeface="Myanmar Text"/>
+        <a:font script="Nkoo" typeface="Ebrima"/>
+        <a:font script="Olck" typeface="Nirmala UI"/>
+        <a:font script="Osma" typeface="Ebrima"/>
+        <a:font script="Phag" typeface="Phagspa"/>
+        <a:font script="Syrn" typeface="Estrangelo Edessa"/>
+        <a:font script="Syrj" typeface="Estrangelo Edessa"/>
+        <a:font script="Syre" typeface="Estrangelo Edessa"/>
+        <a:font script="Sora" typeface="Nirmala UI"/>
+        <a:font script="Tale" typeface="Microsoft Tai Le"/>
+        <a:font script="Talu" typeface="Microsoft New Tai Lue"/>
+        <a:font script="Tfng" typeface="Ebrima"/>
+      </a:majorFont>
+      <a:minorFont>
+        <a:latin typeface="Calibri" panose="020F0502020204030204"/>
+        <a:ea typeface=""/>
+        <a:cs typeface=""/>
+        <a:font script="Jpan" typeface="游明朝"/>
+        <a:font script="Hang" typeface="맑은 고딕"/>
+        <a:font script="Hans" typeface="等线"/>
+        <a:font script="Hant" typeface="新細明體"/>
+        <a:font script="Arab" typeface="Arial"/>
+        <a:font script="Hebr" typeface="Arial"/>
+        <a:font script="Thai" typeface="Cordia New"/>
+        <a:font script="Ethi" typeface="Nyala"/>
+        <a:font script="Beng" typeface="Vrinda"/>
+        <a:font script="Gujr" typeface="Shruti"/>
+        <a:font script="Khmr" typeface="DaunPenh"/>
+        <a:font script="Knda" typeface="Tunga"/>
+        <a:font script="Guru" typeface="Raavi"/>
+        <a:font script="Cans" typeface="Euphemia"/>
+        <a:font script="Cher" typeface="Plantagenet Cherokee"/>
+        <a:font script="Yiii" typeface="Microsoft Yi Baiti"/>
+        <a:font script="Tibt" typeface="Microsoft Himalaya"/>
+        <a:font script="Thaa" typeface="MV Boli"/>
+        <a:font script="Deva" typeface="Mangal"/>
+        <a:font script="Telu" typeface="Gautami"/>
+        <a:font script="Taml" typeface="Latha"/>
+        <a:font script="Syrc" typeface="Estrangelo Edessa"/>
+        <a:font script="Orya" typeface="Kalinga"/>
+        <a:font script="Mlym" typeface="Kartika"/>
+        <a:font script="Laoo" typeface="DokChampa"/>
+        <a:font script="Sinh" typeface="Iskoola Pota"/>
+        <a:font script="Mong" typeface="Mongolian Baiti"/>
+        <a:font script="Viet" typeface="Arial"/>
+        <a:font script="Uigh" typeface="Microsoft Uighur"/>
+        <a:font script="Geor" typeface="Sylfaen"/>
+        <a:font script="Armn" typeface="Arial"/>
+        <a:font script="Bugi" typeface="Leelawadee UI"/>
+        <a:font script="Bopo" typeface="Microsoft JhengHei"/>
+        <a:font script="Java" typeface="Javanese Text"/>
+        <a:font script="Lisu" typeface="Segoe UI"/>
+        <a:font script="Mymr" typeface="Myanmar Text"/>
+        <a:font script="Nkoo" typeface="Ebrima"/>
+        <a:font script="Olck" typeface="Nirmala UI"/>
+        <a:font script="Osma" typeface="Ebrima"/>
+        <a:font script="Phag" typeface="Phagspa"/>
+        <a:font script="Syrn" typeface="Estrangelo Edessa"/>
+        <a:font script="Syrj" typeface="Estrangelo Edessa"/>
+        <a:font script="Syre" typeface="Estrangelo Edessa"/>
+        <a:font script="Sora" typeface="Nirmala UI"/>
+        <a:font script="Tale" typeface="Microsoft Tai Le"/>
+        <a:font script="Talu" typeface="Microsoft New Tai Lue"/>
+        <a:font script="Tfng" typeface="Ebrima"/>
+      </a:minorFont>
+    </a:fontScheme>
+    <a:fmtScheme name="Office">
+      <a:fillStyleLst>
+        <a:solidFill>
+          <a:schemeClr val="phClr"/>
+        </a:solidFill>
+        <a:gradFill rotWithShape="true">
+          <a:gsLst>
+            <a:gs pos="0">
+              <a:schemeClr val="phClr">
+                <a:lumMod val="110000"/>
+                <a:satMod val="105000"/>
+                <a:tint val="67000"/>
+              </a:schemeClr>
+            </a:gs>
+            <a:gs pos="50000">
+              <a:schemeClr val="phClr">
+                <a:lumMod val="105000"/>
+                <a:satMod val="103000"/>
+                <a:tint val="73000"/>
+              </a:schemeClr>
+            </a:gs>
+            <a:gs pos="100000">
+              <a:schemeClr val="phClr">
+                <a:lumMod val="105000"/>
+                <a:satMod val="109000"/>
+                <a:tint val="81000"/>
+              </a:schemeClr>
+            </a:gs>
+          </a:gsLst>
+          <a:lin ang="5400000" scaled="false"/>
+        </a:gradFill>
+        <a:gradFill rotWithShape="true">
+          <a:gsLst>
+            <a:gs pos="0">
+              <a:schemeClr val="phClr">
+                <a:satMod val="103000"/>
+                <a:lumMod val="102000"/>
+                <a:tint val="94000"/>
+              </a:schemeClr>
+            </a:gs>
+            <a:gs pos="50000">
+              <a:schemeClr val="phClr">
+                <a:satMod val="110000"/>
+                <a:lumMod val="100000"/>
+                <a:shade val="100000"/>
+              </a:schemeClr>
+            </a:gs>
+            <a:gs pos="100000">
+              <a:schemeClr val="phClr">
+                <a:lumMod val="99000"/>
+                <a:satMod val="120000"/>
+                <a:shade val="78000"/>
+              </a:schemeClr>
+            </a:gs>
+          </a:gsLst>
+          <a:lin ang="5400000" scaled="false"/>
+        </a:gradFill>
+      </a:fillStyleLst>
+      <a:lnStyleLst>
+        <a:ln w="6350" cap="flat" cmpd="sng" algn="ctr">
+          <a:solidFill>
+            <a:schemeClr val="phClr"/>
+          </a:solidFill>
+          <a:prstDash val="solid"/>
+          <a:miter lim="800000"/>
+        </a:ln>
+        <a:ln w="12700" cap="flat" cmpd="sng" algn="ctr">
+          <a:solidFill>
+            <a:schemeClr val="phClr"/>
+          </a:solidFill>
+          <a:prstDash val="solid"/>
+          <a:miter lim="800000"/>
+        </a:ln>
+        <a:ln w="19050" cap="flat" cmpd="sng" algn="ctr">
+          <a:solidFill>
+            <a:schemeClr val="phClr"/>
+          </a:solidFill>
+          <a:prstDash val="solid"/>
+          <a:miter lim="800000"/>
+        </a:ln>
+      </a:lnStyleLst>
+      <a:effectStyleLst>
+        <a:effectStyle>
+          <a:effectLst/>
+        </a:effectStyle>
+        <a:effectStyle>
+          <a:effectLst/>
+        </a:effectStyle>
+        <a:effectStyle>
+          <a:effectLst>
+            <a:outerShdw blurRad="57150" dist="19050" dir="5400000" algn="ctr" rotWithShape="false">
+              <a:srgbClr val="000000">
+                <a:alpha val="63000"/>
+              </a:srgbClr>
+            </a:outerShdw>
+          </a:effectLst>
+        </a:effectStyle>
+      </a:effectStyleLst>
+      <a:bgFillStyleLst>
+        <a:solidFill>
+          <a:schemeClr val="phClr"/>
+        </a:solidFill>
+        <a:solidFill>
+          <a:schemeClr val="phClr">
+            <a:tint val="95000"/>
+            <a:satMod val="170000"/>
+          </a:schemeClr>
+        </a:solidFill>
+        <a:gradFill rotWithShape="true">
+          <a:gsLst>
+            <a:gs pos="0">
+              <a:schemeClr val="phClr">
+                <a:tint val="93000"/>
+                <a:satMod val="150000"/>
+                <a:shade val="98000"/>
+                <a:lumMod val="102000"/>
+              </a:schemeClr>
+            </a:gs>
+            <a:gs pos="50000">
+              <a:schemeClr val="phClr">
+                <a:tint val="98000"/>
+                <a:satMod val="130000"/>
+                <a:shade val="90000"/>
+                <a:lumMod val="103000"/>
+              </a:schemeClr>
+            </a:gs>
+            <a:gs pos="100000">
+              <a:schemeClr val="phClr">
+                <a:shade val="63000"/>
+                <a:satMod val="120000"/>
+              </a:schemeClr>
+            </a:gs>
+          </a:gsLst>
+          <a:lin ang="5400000" scaled="false"/>
+        </a:gradFill>
+      </a:bgFillStyleLst>
+    </a:fmtScheme>
+  </a:themeElements>
+  <a:objectDefaults/>
+  <a:extraClrSchemeLst/>
+</a:theme>
 </file>
</xml_diff>

<commit_message>
New pricing (397/597/797 + taxes) and simplified home; update sectors, contracts, flyers, onboarding and docs
Home is now generated (tools/build_home.py); previous home kept as tools/home_source.html for sector styles.

Co-Authored-By: Claude Sonnet 5.5 <noreply@anthropic.com>
Claude-Session: https://claude.ai/code/session_01Len3qw9FeiFukG2e1yHcQr
</commit_message>
<xml_diff>
--- a/docs/legal/AI-Staff_Contrat-de-service_FR.docx
+++ b/docs/legal/AI-Staff_Contrat-de-service_FR.docx
@@ -2734,7 +2734,7 @@
                 <w:sz w:val="19"/>
                 <w:szCs w:val="19"/>
               </w:rPr>
-              <w:t xml:space="preserve">Assistante</w:t>
+              <w:t xml:space="preserve">Essentiel</w:t>
             </w:r>
           </w:p>
         </w:tc>
@@ -2758,7 +2758,7 @@
                 <w:sz w:val="19"/>
                 <w:szCs w:val="19"/>
               </w:rPr>
-              <w:t xml:space="preserve">997 $</w:t>
+              <w:t xml:space="preserve">397 $</w:t>
             </w:r>
           </w:p>
         </w:tc>
@@ -2782,7 +2782,7 @@
                 <w:sz w:val="19"/>
                 <w:szCs w:val="19"/>
               </w:rPr>
-              <w:t xml:space="preserve">Appels et SMS 24/7, prise de rendez-vous, tableau de bord, jusqu'à 3 langues</w:t>
+              <w:t xml:space="preserve">Numéro dédié et appels 24/7 (FR, EN, ES), SMS, rendez-vous dans votre agenda, tableau de bord privé, appels à l'adjointe pour demander vos rapports</w:t>
             </w:r>
           </w:p>
         </w:tc>
@@ -2837,14 +2837,7 @@
                 <w:sz w:val="19"/>
                 <w:szCs w:val="19"/>
               </w:rPr>
-              <w:t xml:space="preserve">Exécutive</w:t>
-            </w:r>
-            <w:r>
-              <w:rPr>
-                <w:sz w:val="19"/>
-                <w:szCs w:val="19"/>
-              </w:rPr>
-              <w:t xml:space="preserve"> (recommandé)</w:t>
+              <w:t xml:space="preserve">Pro</w:t>
             </w:r>
           </w:p>
         </w:tc>
@@ -2868,7 +2861,7 @@
                 <w:sz w:val="19"/>
                 <w:szCs w:val="19"/>
               </w:rPr>
-              <w:t xml:space="preserve">1 497 $</w:t>
+              <w:t xml:space="preserve">597 $</w:t>
             </w:r>
           </w:p>
         </w:tc>
@@ -2892,7 +2885,7 @@
                 <w:sz w:val="19"/>
                 <w:szCs w:val="19"/>
               </w:rPr>
-              <w:t xml:space="preserve">Tout Assistante + suivis, briefings, canaux supplémentaires par phases, jusqu'à 5 langues</w:t>
+              <w:t xml:space="preserve">Tout Essentiel + WhatsApp, appels programmés de l'adjointe vers vous (jusqu'à 3 par jour), appels illimités (usage raisonnable)</w:t>
             </w:r>
           </w:p>
         </w:tc>
@@ -2947,7 +2940,7 @@
                 <w:sz w:val="19"/>
                 <w:szCs w:val="19"/>
               </w:rPr>
-              <w:t xml:space="preserve">Dédiée</w:t>
+              <w:t xml:space="preserve">Complet</w:t>
             </w:r>
           </w:p>
         </w:tc>
@@ -2971,7 +2964,7 @@
                 <w:sz w:val="19"/>
                 <w:szCs w:val="19"/>
               </w:rPr>
-              <w:t xml:space="preserve">2 497 $</w:t>
+              <w:t xml:space="preserve">797 $</w:t>
             </w:r>
           </w:p>
         </w:tc>
@@ -2995,7 +2988,7 @@
                 <w:sz w:val="19"/>
                 <w:szCs w:val="19"/>
               </w:rPr>
-              <w:t xml:space="preserve">Tout Exécutive + configuration sur mesure, soutien prioritaire, toutes les langues offertes</w:t>
+              <w:t xml:space="preserve">Tout Pro + messages Instagram et Facebook, statistiques de vos réseaux sociaux, accès prioritaire</w:t>
             </w:r>
           </w:p>
         </w:tc>
@@ -3374,7 +3367,7 @@
                 <w:sz w:val="19"/>
                 <w:szCs w:val="19"/>
               </w:rPr>
-              <w:t xml:space="preserve">________________________________________ (selon le plan)</w:t>
+              <w:t xml:space="preserve">________________________________________ (FR, EN, ES)</w:t>
             </w:r>
           </w:p>
         </w:tc>
@@ -3821,76 +3814,6 @@
                 <w:szCs w:val="19"/>
               </w:rPr>
               <w:t xml:space="preserve">☐ Actif</w:t>
-            </w:r>
-          </w:p>
-        </w:tc>
-        <w:tc>
-          <w:tcPr>
-            <w:tcW w:type="dxa" w:w="3305"/>
-            <w:tcMar>
-              <w:top w:type="dxa" w:w="70"/>
-              <w:left w:type="dxa" w:w="110"/>
-              <w:bottom w:type="dxa" w:w="70"/>
-              <w:right w:type="dxa" w:w="110"/>
-            </w:tcMar>
-            <w:vAlign w:val="center"/>
-          </w:tcPr>
-          <w:p>
-            <w:pPr>
-              <w:spacing w:after="40" w:before="40"/>
-            </w:pPr>
-          </w:p>
-        </w:tc>
-      </w:tr>
-      <w:tr>
-        <w:trPr>
-          <w:tblHeader w:val="false"/>
-        </w:trPr>
-        <w:tc>
-          <w:tcPr>
-            <w:tcW w:type="dxa" w:w="4082"/>
-            <w:tcMar>
-              <w:top w:type="dxa" w:w="70"/>
-              <w:left w:type="dxa" w:w="110"/>
-              <w:bottom w:type="dxa" w:w="70"/>
-              <w:right w:type="dxa" w:w="110"/>
-            </w:tcMar>
-            <w:vAlign w:val="center"/>
-          </w:tcPr>
-          <w:p>
-            <w:pPr>
-              <w:spacing w:after="40" w:before="40"/>
-            </w:pPr>
-            <w:r>
-              <w:rPr>
-                <w:sz w:val="19"/>
-                <w:szCs w:val="19"/>
-              </w:rPr>
-              <w:t xml:space="preserve">Courriel</w:t>
-            </w:r>
-          </w:p>
-        </w:tc>
-        <w:tc>
-          <w:tcPr>
-            <w:tcW w:type="dxa" w:w="2333"/>
-            <w:tcMar>
-              <w:top w:type="dxa" w:w="70"/>
-              <w:left w:type="dxa" w:w="110"/>
-              <w:bottom w:type="dxa" w:w="70"/>
-              <w:right w:type="dxa" w:w="110"/>
-            </w:tcMar>
-            <w:vAlign w:val="center"/>
-          </w:tcPr>
-          <w:p>
-            <w:pPr>
-              <w:spacing w:after="40" w:before="40"/>
-            </w:pPr>
-            <w:r>
-              <w:rPr>
-                <w:sz w:val="19"/>
-                <w:szCs w:val="19"/>
-              </w:rPr>
-              <w:t xml:space="preserve">☐ Par phases</w:t>
             </w:r>
           </w:p>
         </w:tc>

</xml_diff>